<commit_message>
module-7/LongModule7.2.docx, module-8/LongModule8.2.docx, module-8/movies_update_and_delete..py, module-8/~.2.docx, movies_queries.py
</commit_message>
<xml_diff>
--- a/module-7/LongModule7.2.docx
+++ b/module-7/LongModule7.2.docx
@@ -23,7 +23,7 @@
           <w:noProof/>
         </w:rPr>
         <w:drawing>
-          <wp:inline distT="0" distB="0" distL="0" distR="0" wp14:anchorId="45E86C99" wp14:editId="45F22935">
+          <wp:inline distT="0" distB="0" distL="0" distR="0" wp14:anchorId="45E86C99" wp14:editId="09DE719B">
             <wp:extent cx="7343775" cy="4130873"/>
             <wp:effectExtent l="0" t="0" r="0" b="3175"/>
             <wp:docPr id="1030146083" name="Picture 1"/>
@@ -67,17 +67,20 @@
     </w:p>
     <w:p>
       <w:r>
-        <w:t xml:space="preserve">At first, I got this error when testing and running for bugs. Then I realized I had not moved the .env file into the module 7 folder, to which it could connect. After that, I reran it </w:t>
-      </w:r>
-      <w:proofErr w:type="gramStart"/>
-      <w:r>
-        <w:t>with</w:t>
-      </w:r>
-      <w:proofErr w:type="gramEnd"/>
-      <w:r>
-        <w:t xml:space="preserve"> debugging.</w:t>
+        <w:t>At first, I got this error when testing and running for bugs. Then I realized I had not moved the .env file into the module 7 folder, to which it could connect. After that, I reran it with debugging.</w:t>
       </w:r>
     </w:p>
+    <w:p>
+      <w:hyperlink r:id="rId5" w:history="1">
+        <w:r>
+          <w:rPr>
+            <w:rStyle w:val="Hyperlink"/>
+          </w:rPr>
+          <w:t>https://github.com/KitsuneGakusei/CSD-310.git</w:t>
+        </w:r>
+      </w:hyperlink>
+    </w:p>
+    <w:p/>
     <w:p>
       <w:r>
         <w:rPr>
@@ -85,7 +88,7 @@
         </w:rPr>
         <w:lastRenderedPageBreak/>
         <w:drawing>
-          <wp:inline distT="0" distB="0" distL="0" distR="0" wp14:anchorId="460D5B8B" wp14:editId="50C2382E">
+          <wp:inline distT="0" distB="0" distL="0" distR="0" wp14:anchorId="460D5B8B" wp14:editId="0FC4BEF5">
             <wp:extent cx="7058025" cy="3970139"/>
             <wp:effectExtent l="0" t="0" r="0" b="0"/>
             <wp:docPr id="610304319" name="Picture 2"/>
@@ -100,7 +103,7 @@
                     <pic:cNvPicPr/>
                   </pic:nvPicPr>
                   <pic:blipFill>
-                    <a:blip r:embed="rId5" cstate="print">
+                    <a:blip r:embed="rId6" cstate="print">
                       <a:extLst>
                         <a:ext uri="{28A0092B-C50C-407E-A947-70E740481C1C}">
                           <a14:useLocalDpi xmlns:a14="http://schemas.microsoft.com/office/drawing/2010/main" val="0"/>
@@ -1055,6 +1058,29 @@
       <w:spacing w:val="5"/>
     </w:rPr>
   </w:style>
+  <w:style w:type="character" w:styleId="Hyperlink">
+    <w:name w:val="Hyperlink"/>
+    <w:basedOn w:val="DefaultParagraphFont"/>
+    <w:uiPriority w:val="99"/>
+    <w:unhideWhenUsed/>
+    <w:rsid w:val="00B74D86"/>
+    <w:rPr>
+      <w:color w:val="467886" w:themeColor="hyperlink"/>
+      <w:u w:val="single"/>
+    </w:rPr>
+  </w:style>
+  <w:style w:type="character" w:styleId="UnresolvedMention">
+    <w:name w:val="Unresolved Mention"/>
+    <w:basedOn w:val="DefaultParagraphFont"/>
+    <w:uiPriority w:val="99"/>
+    <w:semiHidden/>
+    <w:unhideWhenUsed/>
+    <w:rsid w:val="00B74D86"/>
+    <w:rPr>
+      <w:color w:val="605E5C"/>
+      <w:shd w:val="clear" w:color="auto" w:fill="E1DFDD"/>
+    </w:rPr>
+  </w:style>
 </w:styles>
 </file>
 

</xml_diff>